<commit_message>
CV du 7 octobre
</commit_message>
<xml_diff>
--- a/livrables/Lippens_Charles_2_audit_qualite_092026.docx
+++ b/livrables/Lippens_Charles_2_audit_qualite_092026.docx
@@ -219,19 +219,1063 @@
       </w:r>
     </w:p>
     <w:p>
+      <w:pPr>
+        <w:tabs>
+          <w:tab w:val="right" w:leader="dot" w:pos="9298"/>
+        </w:tabs>
+        <w:spacing w:after="40"/>
+        <w:ind w:left="0"/>
+      </w:pPr>
       <w:r>
-        <w:fldChar w:fldCharType="begin" w:dirty="true"/>
+        <w:fldChar w:fldCharType="begin"/>
+      </w:r>
+      <w:r>
         <w:instrText xml:space="preserve">TOC \o "1-3" \h \z \u</w:instrText>
+      </w:r>
+      <w:r>
         <w:fldChar w:fldCharType="separate"/>
       </w:r>
-      <w:r>
-        <w:rPr>
-          <w:i/>
-          <w:color w:val="64748B"/>
-          <w:sz w:val="18"/>
-        </w:rPr>
-        <w:t>Ouvrez le document dans Word puis appuyez sur F9 pour actualiser le sommaire.</w:t>
-      </w:r>
+      <w:hyperlink w:anchor="_TocP130001" w:history="1">
+        <w:r>
+          <w:rPr>
+            <w:rFonts w:ascii="Calibri" w:hAnsi="Calibri"/>
+            <w:color w:val="1F2937"/>
+            <w:sz w:val="21"/>
+          </w:rPr>
+          <w:t xml:space="preserve">1. Objet et méthode de l'audit</w:t>
+        </w:r>
+        <w:r>
+          <w:rPr>
+            <w:rFonts w:ascii="Calibri" w:hAnsi="Calibri"/>
+            <w:color w:val="1F2937"/>
+            <w:sz w:val="21"/>
+          </w:rPr>
+          <w:tab/>
+        </w:r>
+        <w:r>
+          <w:rPr>
+            <w:rFonts w:ascii="Calibri" w:hAnsi="Calibri"/>
+            <w:color w:val="1F2937"/>
+            <w:sz w:val="21"/>
+          </w:rPr>
+          <w:t>3</w:t>
+        </w:r>
+      </w:hyperlink>
+    </w:p>
+    <w:p>
+      <w:pPr>
+        <w:tabs>
+          <w:tab w:val="right" w:leader="dot" w:pos="9298"/>
+        </w:tabs>
+        <w:spacing w:after="40"/>
+        <w:ind w:left="340"/>
+      </w:pPr>
+      <w:hyperlink w:anchor="_TocP130002" w:history="1">
+        <w:r>
+          <w:rPr>
+            <w:rFonts w:ascii="Calibri" w:hAnsi="Calibri"/>
+            <w:color w:val="1F2937"/>
+            <w:sz w:val="21"/>
+          </w:rPr>
+          <w:t xml:space="preserve">1.1 Méthode retenue</w:t>
+        </w:r>
+        <w:r>
+          <w:rPr>
+            <w:rFonts w:ascii="Calibri" w:hAnsi="Calibri"/>
+            <w:color w:val="1F2937"/>
+            <w:sz w:val="21"/>
+          </w:rPr>
+          <w:tab/>
+        </w:r>
+        <w:r>
+          <w:rPr>
+            <w:rFonts w:ascii="Calibri" w:hAnsi="Calibri"/>
+            <w:color w:val="1F2937"/>
+            <w:sz w:val="21"/>
+          </w:rPr>
+          <w:t>3</w:t>
+        </w:r>
+      </w:hyperlink>
+    </w:p>
+    <w:p>
+      <w:pPr>
+        <w:tabs>
+          <w:tab w:val="right" w:leader="dot" w:pos="9298"/>
+        </w:tabs>
+        <w:spacing w:after="40"/>
+        <w:ind w:left="340"/>
+      </w:pPr>
+      <w:hyperlink w:anchor="_TocP130003" w:history="1">
+        <w:r>
+          <w:rPr>
+            <w:rFonts w:ascii="Calibri" w:hAnsi="Calibri"/>
+            <w:color w:val="1F2937"/>
+            <w:sz w:val="21"/>
+          </w:rPr>
+          <w:t xml:space="preserve">1.2 Échelle de statut employée</w:t>
+        </w:r>
+        <w:r>
+          <w:rPr>
+            <w:rFonts w:ascii="Calibri" w:hAnsi="Calibri"/>
+            <w:color w:val="1F2937"/>
+            <w:sz w:val="21"/>
+          </w:rPr>
+          <w:tab/>
+        </w:r>
+        <w:r>
+          <w:rPr>
+            <w:rFonts w:ascii="Calibri" w:hAnsi="Calibri"/>
+            <w:color w:val="1F2937"/>
+            <w:sz w:val="21"/>
+          </w:rPr>
+          <w:t>3</w:t>
+        </w:r>
+      </w:hyperlink>
+    </w:p>
+    <w:p>
+      <w:pPr>
+        <w:tabs>
+          <w:tab w:val="right" w:leader="dot" w:pos="9298"/>
+        </w:tabs>
+        <w:spacing w:after="40"/>
+        <w:ind w:left="0"/>
+      </w:pPr>
+      <w:hyperlink w:anchor="_TocP130004" w:history="1">
+        <w:r>
+          <w:rPr>
+            <w:rFonts w:ascii="Calibri" w:hAnsi="Calibri"/>
+            <w:color w:val="1F2937"/>
+            <w:sz w:val="21"/>
+          </w:rPr>
+          <w:t xml:space="preserve">2. Conformité aux livrables attendus</w:t>
+        </w:r>
+        <w:r>
+          <w:rPr>
+            <w:rFonts w:ascii="Calibri" w:hAnsi="Calibri"/>
+            <w:color w:val="1F2937"/>
+            <w:sz w:val="21"/>
+          </w:rPr>
+          <w:tab/>
+        </w:r>
+        <w:r>
+          <w:rPr>
+            <w:rFonts w:ascii="Calibri" w:hAnsi="Calibri"/>
+            <w:color w:val="1F2937"/>
+            <w:sz w:val="21"/>
+          </w:rPr>
+          <w:t>3</w:t>
+        </w:r>
+      </w:hyperlink>
+    </w:p>
+    <w:p>
+      <w:pPr>
+        <w:tabs>
+          <w:tab w:val="right" w:leader="dot" w:pos="9298"/>
+        </w:tabs>
+        <w:spacing w:after="40"/>
+        <w:ind w:left="0"/>
+      </w:pPr>
+      <w:hyperlink w:anchor="_TocP130005" w:history="1">
+        <w:r>
+          <w:rPr>
+            <w:rFonts w:ascii="Calibri" w:hAnsi="Calibri"/>
+            <w:color w:val="1F2937"/>
+            <w:sz w:val="21"/>
+          </w:rPr>
+          <w:t xml:space="preserve">3. Grille des indicateurs de qualité, renseignée et auditée</w:t>
+        </w:r>
+        <w:r>
+          <w:rPr>
+            <w:rFonts w:ascii="Calibri" w:hAnsi="Calibri"/>
+            <w:color w:val="1F2937"/>
+            <w:sz w:val="21"/>
+          </w:rPr>
+          <w:tab/>
+        </w:r>
+        <w:r>
+          <w:rPr>
+            <w:rFonts w:ascii="Calibri" w:hAnsi="Calibri"/>
+            <w:color w:val="1F2937"/>
+            <w:sz w:val="21"/>
+          </w:rPr>
+          <w:t>4</w:t>
+        </w:r>
+      </w:hyperlink>
+    </w:p>
+    <w:p>
+      <w:pPr>
+        <w:tabs>
+          <w:tab w:val="right" w:leader="dot" w:pos="9298"/>
+        </w:tabs>
+        <w:spacing w:after="40"/>
+        <w:ind w:left="340"/>
+      </w:pPr>
+      <w:hyperlink w:anchor="_TocP130006" w:history="1">
+        <w:r>
+          <w:rPr>
+            <w:rFonts w:ascii="Calibri" w:hAnsi="Calibri"/>
+            <w:color w:val="1F2937"/>
+            <w:sz w:val="21"/>
+          </w:rPr>
+          <w:t xml:space="preserve">3.1 Veille technologique et méthodologique</w:t>
+        </w:r>
+        <w:r>
+          <w:rPr>
+            <w:rFonts w:ascii="Calibri" w:hAnsi="Calibri"/>
+            <w:color w:val="1F2937"/>
+            <w:sz w:val="21"/>
+          </w:rPr>
+          <w:tab/>
+        </w:r>
+        <w:r>
+          <w:rPr>
+            <w:rFonts w:ascii="Calibri" w:hAnsi="Calibri"/>
+            <w:color w:val="1F2937"/>
+            <w:sz w:val="21"/>
+          </w:rPr>
+          <w:t>4</w:t>
+        </w:r>
+      </w:hyperlink>
+    </w:p>
+    <w:p>
+      <w:pPr>
+        <w:tabs>
+          <w:tab w:val="right" w:leader="dot" w:pos="9298"/>
+        </w:tabs>
+        <w:spacing w:after="40"/>
+        <w:ind w:left="340"/>
+      </w:pPr>
+      <w:hyperlink w:anchor="_TocP130007" w:history="1">
+        <w:r>
+          <w:rPr>
+            <w:rFonts w:ascii="Calibri" w:hAnsi="Calibri"/>
+            <w:color w:val="1F2937"/>
+            <w:sz w:val="21"/>
+          </w:rPr>
+          <w:t xml:space="preserve">3.2 Identification du besoin métier</w:t>
+        </w:r>
+        <w:r>
+          <w:rPr>
+            <w:rFonts w:ascii="Calibri" w:hAnsi="Calibri"/>
+            <w:color w:val="1F2937"/>
+            <w:sz w:val="21"/>
+          </w:rPr>
+          <w:tab/>
+        </w:r>
+        <w:r>
+          <w:rPr>
+            <w:rFonts w:ascii="Calibri" w:hAnsi="Calibri"/>
+            <w:color w:val="1F2937"/>
+            <w:sz w:val="21"/>
+          </w:rPr>
+          <w:t>5</w:t>
+        </w:r>
+      </w:hyperlink>
+    </w:p>
+    <w:p>
+      <w:pPr>
+        <w:tabs>
+          <w:tab w:val="right" w:leader="dot" w:pos="9298"/>
+        </w:tabs>
+        <w:spacing w:after="40"/>
+        <w:ind w:left="340"/>
+      </w:pPr>
+      <w:hyperlink w:anchor="_TocP130008" w:history="1">
+        <w:r>
+          <w:rPr>
+            <w:rFonts w:ascii="Calibri" w:hAnsi="Calibri"/>
+            <w:color w:val="1F2937"/>
+            <w:sz w:val="21"/>
+          </w:rPr>
+          <w:t xml:space="preserve">3.3 Formalisation du cahier des charges fonctionnel</w:t>
+        </w:r>
+        <w:r>
+          <w:rPr>
+            <w:rFonts w:ascii="Calibri" w:hAnsi="Calibri"/>
+            <w:color w:val="1F2937"/>
+            <w:sz w:val="21"/>
+          </w:rPr>
+          <w:tab/>
+        </w:r>
+        <w:r>
+          <w:rPr>
+            <w:rFonts w:ascii="Calibri" w:hAnsi="Calibri"/>
+            <w:color w:val="1F2937"/>
+            <w:sz w:val="21"/>
+          </w:rPr>
+          <w:t>5</w:t>
+        </w:r>
+      </w:hyperlink>
+    </w:p>
+    <w:p>
+      <w:pPr>
+        <w:tabs>
+          <w:tab w:val="right" w:leader="dot" w:pos="9298"/>
+        </w:tabs>
+        <w:spacing w:after="40"/>
+        <w:ind w:left="340"/>
+      </w:pPr>
+      <w:hyperlink w:anchor="_TocP130009" w:history="1">
+        <w:r>
+          <w:rPr>
+            <w:rFonts w:ascii="Calibri" w:hAnsi="Calibri"/>
+            <w:color w:val="1F2937"/>
+            <w:sz w:val="21"/>
+          </w:rPr>
+          <w:t xml:space="preserve">3.4 Objectifs pédagogiques du projet</w:t>
+        </w:r>
+        <w:r>
+          <w:rPr>
+            <w:rFonts w:ascii="Calibri" w:hAnsi="Calibri"/>
+            <w:color w:val="1F2937"/>
+            <w:sz w:val="21"/>
+          </w:rPr>
+          <w:tab/>
+        </w:r>
+        <w:r>
+          <w:rPr>
+            <w:rFonts w:ascii="Calibri" w:hAnsi="Calibri"/>
+            <w:color w:val="1F2937"/>
+            <w:sz w:val="21"/>
+          </w:rPr>
+          <w:t>6</w:t>
+        </w:r>
+      </w:hyperlink>
+    </w:p>
+    <w:p>
+      <w:pPr>
+        <w:tabs>
+          <w:tab w:val="right" w:leader="dot" w:pos="9298"/>
+        </w:tabs>
+        <w:spacing w:after="40"/>
+        <w:ind w:left="0"/>
+      </w:pPr>
+      <w:hyperlink w:anchor="_TocP130010" w:history="1">
+        <w:r>
+          <w:rPr>
+            <w:rFonts w:ascii="Calibri" w:hAnsi="Calibri"/>
+            <w:color w:val="1F2937"/>
+            <w:sz w:val="21"/>
+          </w:rPr>
+          <w:t xml:space="preserve">4. Contrôle des chiffres publiés</w:t>
+        </w:r>
+        <w:r>
+          <w:rPr>
+            <w:rFonts w:ascii="Calibri" w:hAnsi="Calibri"/>
+            <w:color w:val="1F2937"/>
+            <w:sz w:val="21"/>
+          </w:rPr>
+          <w:tab/>
+        </w:r>
+        <w:r>
+          <w:rPr>
+            <w:rFonts w:ascii="Calibri" w:hAnsi="Calibri"/>
+            <w:color w:val="1F2937"/>
+            <w:sz w:val="21"/>
+          </w:rPr>
+          <w:t>7</w:t>
+        </w:r>
+      </w:hyperlink>
+    </w:p>
+    <w:p>
+      <w:pPr>
+        <w:tabs>
+          <w:tab w:val="right" w:leader="dot" w:pos="9298"/>
+        </w:tabs>
+        <w:spacing w:after="40"/>
+        <w:ind w:left="340"/>
+      </w:pPr>
+      <w:hyperlink w:anchor="_TocP130011" w:history="1">
+        <w:r>
+          <w:rPr>
+            <w:rFonts w:ascii="Calibri" w:hAnsi="Calibri"/>
+            <w:color w:val="1F2937"/>
+            <w:sz w:val="21"/>
+          </w:rPr>
+          <w:t xml:space="preserve">4.1 Résultats déterministes, confirmés à l'identique</w:t>
+        </w:r>
+        <w:r>
+          <w:rPr>
+            <w:rFonts w:ascii="Calibri" w:hAnsi="Calibri"/>
+            <w:color w:val="1F2937"/>
+            <w:sz w:val="21"/>
+          </w:rPr>
+          <w:tab/>
+        </w:r>
+        <w:r>
+          <w:rPr>
+            <w:rFonts w:ascii="Calibri" w:hAnsi="Calibri"/>
+            <w:color w:val="1F2937"/>
+            <w:sz w:val="21"/>
+          </w:rPr>
+          <w:t>7</w:t>
+        </w:r>
+      </w:hyperlink>
+    </w:p>
+    <w:p>
+      <w:pPr>
+        <w:tabs>
+          <w:tab w:val="right" w:leader="dot" w:pos="9298"/>
+        </w:tabs>
+        <w:spacing w:after="40"/>
+        <w:ind w:left="340"/>
+      </w:pPr>
+      <w:hyperlink w:anchor="_TocP130012" w:history="1">
+        <w:r>
+          <w:rPr>
+            <w:rFonts w:ascii="Calibri" w:hAnsi="Calibri"/>
+            <w:color w:val="1F2937"/>
+            <w:sz w:val="21"/>
+          </w:rPr>
+          <w:t xml:space="preserve">4.2 Écarts relevés et corrigés</w:t>
+        </w:r>
+        <w:r>
+          <w:rPr>
+            <w:rFonts w:ascii="Calibri" w:hAnsi="Calibri"/>
+            <w:color w:val="1F2937"/>
+            <w:sz w:val="21"/>
+          </w:rPr>
+          <w:tab/>
+        </w:r>
+        <w:r>
+          <w:rPr>
+            <w:rFonts w:ascii="Calibri" w:hAnsi="Calibri"/>
+            <w:color w:val="1F2937"/>
+            <w:sz w:val="21"/>
+          </w:rPr>
+          <w:t>7</w:t>
+        </w:r>
+      </w:hyperlink>
+    </w:p>
+    <w:p>
+      <w:pPr>
+        <w:tabs>
+          <w:tab w:val="right" w:leader="dot" w:pos="9298"/>
+        </w:tabs>
+        <w:spacing w:after="40"/>
+        <w:ind w:left="680"/>
+      </w:pPr>
+      <w:hyperlink w:anchor="_TocP130013" w:history="1">
+        <w:r>
+          <w:rPr>
+            <w:rFonts w:ascii="Calibri" w:hAnsi="Calibri"/>
+            <w:color w:val="1F2937"/>
+            <w:sz w:val="21"/>
+          </w:rPr>
+          <w:t xml:space="preserve">Écart 1 : facteur d'accélération des moteurs alternatifs</w:t>
+        </w:r>
+        <w:r>
+          <w:rPr>
+            <w:rFonts w:ascii="Calibri" w:hAnsi="Calibri"/>
+            <w:color w:val="1F2937"/>
+            <w:sz w:val="21"/>
+          </w:rPr>
+          <w:tab/>
+        </w:r>
+        <w:r>
+          <w:rPr>
+            <w:rFonts w:ascii="Calibri" w:hAnsi="Calibri"/>
+            <w:color w:val="1F2937"/>
+            <w:sz w:val="21"/>
+          </w:rPr>
+          <w:t>7</w:t>
+        </w:r>
+      </w:hyperlink>
+    </w:p>
+    <w:p>
+      <w:pPr>
+        <w:tabs>
+          <w:tab w:val="right" w:leader="dot" w:pos="9298"/>
+        </w:tabs>
+        <w:spacing w:after="40"/>
+        <w:ind w:left="680"/>
+      </w:pPr>
+      <w:hyperlink w:anchor="_TocP130014" w:history="1">
+        <w:r>
+          <w:rPr>
+            <w:rFonts w:ascii="Calibri" w:hAnsi="Calibri"/>
+            <w:color w:val="1F2937"/>
+            <w:sz w:val="21"/>
+          </w:rPr>
+          <w:t xml:space="preserve">Écart 2 : composition de la liste des critères de comparaison</w:t>
+        </w:r>
+        <w:r>
+          <w:rPr>
+            <w:rFonts w:ascii="Calibri" w:hAnsi="Calibri"/>
+            <w:color w:val="1F2937"/>
+            <w:sz w:val="21"/>
+          </w:rPr>
+          <w:tab/>
+        </w:r>
+        <w:r>
+          <w:rPr>
+            <w:rFonts w:ascii="Calibri" w:hAnsi="Calibri"/>
+            <w:color w:val="1F2937"/>
+            <w:sz w:val="21"/>
+          </w:rPr>
+          <w:t>8</w:t>
+        </w:r>
+      </w:hyperlink>
+    </w:p>
+    <w:p>
+      <w:pPr>
+        <w:tabs>
+          <w:tab w:val="right" w:leader="dot" w:pos="9298"/>
+        </w:tabs>
+        <w:spacing w:after="40"/>
+        <w:ind w:left="680"/>
+      </w:pPr>
+      <w:hyperlink w:anchor="_TocP130015" w:history="1">
+        <w:r>
+          <w:rPr>
+            <w:rFonts w:ascii="Calibri" w:hAnsi="Calibri"/>
+            <w:color w:val="1F2937"/>
+            <w:sz w:val="21"/>
+          </w:rPr>
+          <w:t xml:space="preserve">Écart 3 : numérotation des jalons</w:t>
+        </w:r>
+        <w:r>
+          <w:rPr>
+            <w:rFonts w:ascii="Calibri" w:hAnsi="Calibri"/>
+            <w:color w:val="1F2937"/>
+            <w:sz w:val="21"/>
+          </w:rPr>
+          <w:tab/>
+        </w:r>
+        <w:r>
+          <w:rPr>
+            <w:rFonts w:ascii="Calibri" w:hAnsi="Calibri"/>
+            <w:color w:val="1F2937"/>
+            <w:sz w:val="21"/>
+          </w:rPr>
+          <w:t>8</w:t>
+        </w:r>
+      </w:hyperlink>
+    </w:p>
+    <w:p>
+      <w:pPr>
+        <w:tabs>
+          <w:tab w:val="right" w:leader="dot" w:pos="9298"/>
+        </w:tabs>
+        <w:spacing w:after="40"/>
+        <w:ind w:left="680"/>
+      </w:pPr>
+      <w:hyperlink w:anchor="_TocP130016" w:history="1">
+        <w:r>
+          <w:rPr>
+            <w:rFonts w:ascii="Calibri" w:hAnsi="Calibri"/>
+            <w:color w:val="1F2937"/>
+            <w:sz w:val="21"/>
+          </w:rPr>
+          <w:t xml:space="preserve">Écart 4 : base de calcul de la concentration du chiffre d'affaires</w:t>
+        </w:r>
+        <w:r>
+          <w:rPr>
+            <w:rFonts w:ascii="Calibri" w:hAnsi="Calibri"/>
+            <w:color w:val="1F2937"/>
+            <w:sz w:val="21"/>
+          </w:rPr>
+          <w:tab/>
+        </w:r>
+        <w:r>
+          <w:rPr>
+            <w:rFonts w:ascii="Calibri" w:hAnsi="Calibri"/>
+            <w:color w:val="1F2937"/>
+            <w:sz w:val="21"/>
+          </w:rPr>
+          <w:t>9</w:t>
+        </w:r>
+      </w:hyperlink>
+    </w:p>
+    <w:p>
+      <w:pPr>
+        <w:tabs>
+          <w:tab w:val="right" w:leader="dot" w:pos="9298"/>
+        </w:tabs>
+        <w:spacing w:after="40"/>
+        <w:ind w:left="680"/>
+      </w:pPr>
+      <w:hyperlink w:anchor="_TocP130017" w:history="1">
+        <w:r>
+          <w:rPr>
+            <w:rFonts w:ascii="Calibri" w:hAnsi="Calibri"/>
+            <w:color w:val="1F2937"/>
+            <w:sz w:val="21"/>
+          </w:rPr>
+          <w:t xml:space="preserve">Écart 5 : lisibilité du rapport de contrôle qualité dans le notebook</w:t>
+        </w:r>
+        <w:r>
+          <w:rPr>
+            <w:rFonts w:ascii="Calibri" w:hAnsi="Calibri"/>
+            <w:color w:val="1F2937"/>
+            <w:sz w:val="21"/>
+          </w:rPr>
+          <w:tab/>
+        </w:r>
+        <w:r>
+          <w:rPr>
+            <w:rFonts w:ascii="Calibri" w:hAnsi="Calibri"/>
+            <w:color w:val="1F2937"/>
+            <w:sz w:val="21"/>
+          </w:rPr>
+          <w:t>9</w:t>
+        </w:r>
+      </w:hyperlink>
+    </w:p>
+    <w:p>
+      <w:pPr>
+        <w:tabs>
+          <w:tab w:val="right" w:leader="dot" w:pos="9298"/>
+        </w:tabs>
+        <w:spacing w:after="40"/>
+        <w:ind w:left="680"/>
+      </w:pPr>
+      <w:hyperlink w:anchor="_TocP130018" w:history="1">
+        <w:r>
+          <w:rPr>
+            <w:rFonts w:ascii="Calibri" w:hAnsi="Calibri"/>
+            <w:color w:val="1F2937"/>
+            <w:sz w:val="21"/>
+          </w:rPr>
+          <w:t xml:space="preserve">Écarts 6 à 11 : corrections rédactionnelles et de complétude</w:t>
+        </w:r>
+        <w:r>
+          <w:rPr>
+            <w:rFonts w:ascii="Calibri" w:hAnsi="Calibri"/>
+            <w:color w:val="1F2937"/>
+            <w:sz w:val="21"/>
+          </w:rPr>
+          <w:tab/>
+        </w:r>
+        <w:r>
+          <w:rPr>
+            <w:rFonts w:ascii="Calibri" w:hAnsi="Calibri"/>
+            <w:color w:val="1F2937"/>
+            <w:sz w:val="21"/>
+          </w:rPr>
+          <w:t>9</w:t>
+        </w:r>
+      </w:hyperlink>
+    </w:p>
+    <w:p>
+      <w:pPr>
+        <w:tabs>
+          <w:tab w:val="right" w:leader="dot" w:pos="9298"/>
+        </w:tabs>
+        <w:spacing w:after="40"/>
+        <w:ind w:left="0"/>
+      </w:pPr>
+      <w:hyperlink w:anchor="_TocP130019" w:history="1">
+        <w:r>
+          <w:rPr>
+            <w:rFonts w:ascii="Calibri" w:hAnsi="Calibri"/>
+            <w:color w:val="1F2937"/>
+            <w:sz w:val="21"/>
+          </w:rPr>
+          <w:t xml:space="preserve">5. Contrôle rédactionnel et accessibilité</w:t>
+        </w:r>
+        <w:r>
+          <w:rPr>
+            <w:rFonts w:ascii="Calibri" w:hAnsi="Calibri"/>
+            <w:color w:val="1F2937"/>
+            <w:sz w:val="21"/>
+          </w:rPr>
+          <w:tab/>
+        </w:r>
+        <w:r>
+          <w:rPr>
+            <w:rFonts w:ascii="Calibri" w:hAnsi="Calibri"/>
+            <w:color w:val="1F2937"/>
+            <w:sz w:val="21"/>
+          </w:rPr>
+          <w:t>9</w:t>
+        </w:r>
+      </w:hyperlink>
+    </w:p>
+    <w:p>
+      <w:pPr>
+        <w:tabs>
+          <w:tab w:val="right" w:leader="dot" w:pos="9298"/>
+        </w:tabs>
+        <w:spacing w:after="40"/>
+        <w:ind w:left="0"/>
+      </w:pPr>
+      <w:hyperlink w:anchor="_TocP130020" w:history="1">
+        <w:r>
+          <w:rPr>
+            <w:rFonts w:ascii="Calibri" w:hAnsi="Calibri"/>
+            <w:color w:val="1F2937"/>
+            <w:sz w:val="21"/>
+          </w:rPr>
+          <w:t xml:space="preserve">6. Risques résiduels et limites de cet audit</w:t>
+        </w:r>
+        <w:r>
+          <w:rPr>
+            <w:rFonts w:ascii="Calibri" w:hAnsi="Calibri"/>
+            <w:color w:val="1F2937"/>
+            <w:sz w:val="21"/>
+          </w:rPr>
+          <w:tab/>
+        </w:r>
+        <w:r>
+          <w:rPr>
+            <w:rFonts w:ascii="Calibri" w:hAnsi="Calibri"/>
+            <w:color w:val="1F2937"/>
+            <w:sz w:val="21"/>
+          </w:rPr>
+          <w:t>10</w:t>
+        </w:r>
+      </w:hyperlink>
+    </w:p>
+    <w:p>
+      <w:pPr>
+        <w:tabs>
+          <w:tab w:val="right" w:leader="dot" w:pos="9298"/>
+        </w:tabs>
+        <w:spacing w:after="40"/>
+        <w:ind w:left="0"/>
+      </w:pPr>
+      <w:hyperlink w:anchor="_TocP130021" w:history="1">
+        <w:r>
+          <w:rPr>
+            <w:rFonts w:ascii="Calibri" w:hAnsi="Calibri"/>
+            <w:color w:val="1F2937"/>
+            <w:sz w:val="21"/>
+          </w:rPr>
+          <w:t xml:space="preserve">7. Conclusion de l'audit</w:t>
+        </w:r>
+        <w:r>
+          <w:rPr>
+            <w:rFonts w:ascii="Calibri" w:hAnsi="Calibri"/>
+            <w:color w:val="1F2937"/>
+            <w:sz w:val="21"/>
+          </w:rPr>
+          <w:tab/>
+        </w:r>
+        <w:r>
+          <w:rPr>
+            <w:rFonts w:ascii="Calibri" w:hAnsi="Calibri"/>
+            <w:color w:val="1F2937"/>
+            <w:sz w:val="21"/>
+          </w:rPr>
+          <w:t>10</w:t>
+        </w:r>
+      </w:hyperlink>
+    </w:p>
+    <w:p>
+      <w:pPr>
+        <w:tabs>
+          <w:tab w:val="right" w:leader="dot" w:pos="9298"/>
+        </w:tabs>
+        <w:spacing w:after="40"/>
+        <w:ind w:left="0"/>
+      </w:pPr>
+      <w:hyperlink w:anchor="_TocP130022" w:history="1">
+        <w:r>
+          <w:rPr>
+            <w:rFonts w:ascii="Calibri" w:hAnsi="Calibri"/>
+            <w:color w:val="1F2937"/>
+            <w:sz w:val="21"/>
+          </w:rPr>
+          <w:t xml:space="preserve">8. Second passage d'audit, 4 août 2026</w:t>
+        </w:r>
+        <w:r>
+          <w:rPr>
+            <w:rFonts w:ascii="Calibri" w:hAnsi="Calibri"/>
+            <w:color w:val="1F2937"/>
+            <w:sz w:val="21"/>
+          </w:rPr>
+          <w:tab/>
+        </w:r>
+        <w:r>
+          <w:rPr>
+            <w:rFonts w:ascii="Calibri" w:hAnsi="Calibri"/>
+            <w:color w:val="1F2937"/>
+            <w:sz w:val="21"/>
+          </w:rPr>
+          <w:t>10</w:t>
+        </w:r>
+      </w:hyperlink>
+    </w:p>
+    <w:p>
+      <w:pPr>
+        <w:tabs>
+          <w:tab w:val="right" w:leader="dot" w:pos="9298"/>
+        </w:tabs>
+        <w:spacing w:after="40"/>
+        <w:ind w:left="340"/>
+      </w:pPr>
+      <w:hyperlink w:anchor="_TocP130023" w:history="1">
+        <w:r>
+          <w:rPr>
+            <w:rFonts w:ascii="Calibri" w:hAnsi="Calibri"/>
+            <w:color w:val="1F2937"/>
+            <w:sz w:val="21"/>
+          </w:rPr>
+          <w:t xml:space="preserve">8.1 Ce que la troisième réexécution confirme</w:t>
+        </w:r>
+        <w:r>
+          <w:rPr>
+            <w:rFonts w:ascii="Calibri" w:hAnsi="Calibri"/>
+            <w:color w:val="1F2937"/>
+            <w:sz w:val="21"/>
+          </w:rPr>
+          <w:tab/>
+        </w:r>
+        <w:r>
+          <w:rPr>
+            <w:rFonts w:ascii="Calibri" w:hAnsi="Calibri"/>
+            <w:color w:val="1F2937"/>
+            <w:sz w:val="21"/>
+          </w:rPr>
+          <w:t>10</w:t>
+        </w:r>
+      </w:hyperlink>
+    </w:p>
+    <w:p>
+      <w:pPr>
+        <w:tabs>
+          <w:tab w:val="right" w:leader="dot" w:pos="9298"/>
+        </w:tabs>
+        <w:spacing w:after="40"/>
+        <w:ind w:left="340"/>
+      </w:pPr>
+      <w:hyperlink w:anchor="_TocP130024" w:history="1">
+        <w:r>
+          <w:rPr>
+            <w:rFonts w:ascii="Calibri" w:hAnsi="Calibri"/>
+            <w:color w:val="1F2937"/>
+            <w:sz w:val="21"/>
+          </w:rPr>
+          <w:t xml:space="preserve">8.2 Écarts relevés et corrigés, numérotés à la suite du premier passage</w:t>
+        </w:r>
+        <w:r>
+          <w:rPr>
+            <w:rFonts w:ascii="Calibri" w:hAnsi="Calibri"/>
+            <w:color w:val="1F2937"/>
+            <w:sz w:val="21"/>
+          </w:rPr>
+          <w:tab/>
+        </w:r>
+        <w:r>
+          <w:rPr>
+            <w:rFonts w:ascii="Calibri" w:hAnsi="Calibri"/>
+            <w:color w:val="1F2937"/>
+            <w:sz w:val="21"/>
+          </w:rPr>
+          <w:t>11</w:t>
+        </w:r>
+      </w:hyperlink>
+    </w:p>
+    <w:p>
+      <w:pPr>
+        <w:tabs>
+          <w:tab w:val="right" w:leader="dot" w:pos="9298"/>
+        </w:tabs>
+        <w:spacing w:after="40"/>
+        <w:ind w:left="340"/>
+      </w:pPr>
+      <w:hyperlink w:anchor="_TocP130025" w:history="1">
+        <w:r>
+          <w:rPr>
+            <w:rFonts w:ascii="Calibri" w:hAnsi="Calibri"/>
+            <w:color w:val="1F2937"/>
+            <w:sz w:val="21"/>
+          </w:rPr>
+          <w:t xml:space="preserve">8.3 Autres vérifications sans écart</w:t>
+        </w:r>
+        <w:r>
+          <w:rPr>
+            <w:rFonts w:ascii="Calibri" w:hAnsi="Calibri"/>
+            <w:color w:val="1F2937"/>
+            <w:sz w:val="21"/>
+          </w:rPr>
+          <w:tab/>
+        </w:r>
+        <w:r>
+          <w:rPr>
+            <w:rFonts w:ascii="Calibri" w:hAnsi="Calibri"/>
+            <w:color w:val="1F2937"/>
+            <w:sz w:val="21"/>
+          </w:rPr>
+          <w:t>12</w:t>
+        </w:r>
+      </w:hyperlink>
+    </w:p>
+    <w:p>
+      <w:pPr>
+        <w:tabs>
+          <w:tab w:val="right" w:leader="dot" w:pos="9298"/>
+        </w:tabs>
+        <w:spacing w:after="40"/>
+        <w:ind w:left="0"/>
+      </w:pPr>
+      <w:hyperlink w:anchor="_TocP130026" w:history="1">
+        <w:r>
+          <w:rPr>
+            <w:rFonts w:ascii="Calibri" w:hAnsi="Calibri"/>
+            <w:color w:val="1F2937"/>
+            <w:sz w:val="21"/>
+          </w:rPr>
+          <w:t xml:space="preserve">9. Troisième passage, 3 septembre 2026 : les portfolios et l'état réel du parcours</w:t>
+        </w:r>
+        <w:r>
+          <w:rPr>
+            <w:rFonts w:ascii="Calibri" w:hAnsi="Calibri"/>
+            <w:color w:val="1F2937"/>
+            <w:sz w:val="21"/>
+          </w:rPr>
+          <w:tab/>
+        </w:r>
+        <w:r>
+          <w:rPr>
+            <w:rFonts w:ascii="Calibri" w:hAnsi="Calibri"/>
+            <w:color w:val="1F2937"/>
+            <w:sz w:val="21"/>
+          </w:rPr>
+          <w:t>12</w:t>
+        </w:r>
+      </w:hyperlink>
+    </w:p>
+    <w:p>
+      <w:pPr>
+        <w:tabs>
+          <w:tab w:val="right" w:leader="dot" w:pos="9298"/>
+        </w:tabs>
+        <w:spacing w:after="40"/>
+        <w:ind w:left="340"/>
+      </w:pPr>
+      <w:hyperlink w:anchor="_TocP130027" w:history="1">
+        <w:r>
+          <w:rPr>
+            <w:rFonts w:ascii="Calibri" w:hAnsi="Calibri"/>
+            <w:color w:val="1F2937"/>
+            <w:sz w:val="21"/>
+          </w:rPr>
+          <w:t xml:space="preserve">9.1 Écarts relevés et corrigés, numérotés à la suite des précédents</w:t>
+        </w:r>
+        <w:r>
+          <w:rPr>
+            <w:rFonts w:ascii="Calibri" w:hAnsi="Calibri"/>
+            <w:color w:val="1F2937"/>
+            <w:sz w:val="21"/>
+          </w:rPr>
+          <w:tab/>
+        </w:r>
+        <w:r>
+          <w:rPr>
+            <w:rFonts w:ascii="Calibri" w:hAnsi="Calibri"/>
+            <w:color w:val="1F2937"/>
+            <w:sz w:val="21"/>
+          </w:rPr>
+          <w:t>13</w:t>
+        </w:r>
+      </w:hyperlink>
+    </w:p>
+    <w:p>
+      <w:pPr>
+        <w:tabs>
+          <w:tab w:val="right" w:leader="dot" w:pos="9298"/>
+        </w:tabs>
+        <w:spacing w:after="40"/>
+        <w:ind w:left="340"/>
+      </w:pPr>
+      <w:hyperlink w:anchor="_TocP130028" w:history="1">
+        <w:r>
+          <w:rPr>
+            <w:rFonts w:ascii="Calibri" w:hAnsi="Calibri"/>
+            <w:color w:val="1F2937"/>
+            <w:sz w:val="21"/>
+          </w:rPr>
+          <w:t xml:space="preserve">9.2 Vérifications rejouées</w:t>
+        </w:r>
+        <w:r>
+          <w:rPr>
+            <w:rFonts w:ascii="Calibri" w:hAnsi="Calibri"/>
+            <w:color w:val="1F2937"/>
+            <w:sz w:val="21"/>
+          </w:rPr>
+          <w:tab/>
+        </w:r>
+        <w:r>
+          <w:rPr>
+            <w:rFonts w:ascii="Calibri" w:hAnsi="Calibri"/>
+            <w:color w:val="1F2937"/>
+            <w:sz w:val="21"/>
+          </w:rPr>
+          <w:t>13</w:t>
+        </w:r>
+      </w:hyperlink>
+    </w:p>
+    <w:p>
+      <w:pPr>
+        <w:tabs>
+          <w:tab w:val="right" w:leader="dot" w:pos="9298"/>
+        </w:tabs>
+        <w:spacing w:after="40"/>
+        <w:ind w:left="0"/>
+      </w:pPr>
+      <w:hyperlink w:anchor="_TocP130029" w:history="1">
+        <w:r>
+          <w:rPr>
+            <w:rFonts w:ascii="Calibri" w:hAnsi="Calibri"/>
+            <w:color w:val="1F2937"/>
+            <w:sz w:val="21"/>
+          </w:rPr>
+          <w:t xml:space="preserve">10. Mise à jour du 17 septembre 2026, à la validation du projet 12</w:t>
+        </w:r>
+        <w:r>
+          <w:rPr>
+            <w:rFonts w:ascii="Calibri" w:hAnsi="Calibri"/>
+            <w:color w:val="1F2937"/>
+            <w:sz w:val="21"/>
+          </w:rPr>
+          <w:tab/>
+        </w:r>
+        <w:r>
+          <w:rPr>
+            <w:rFonts w:ascii="Calibri" w:hAnsi="Calibri"/>
+            <w:color w:val="1F2937"/>
+            <w:sz w:val="21"/>
+          </w:rPr>
+          <w:t>14</w:t>
+        </w:r>
+      </w:hyperlink>
+    </w:p>
+    <w:p>
+      <w:pPr>
+        <w:tabs>
+          <w:tab w:val="right" w:leader="dot" w:pos="9298"/>
+        </w:tabs>
+        <w:spacing w:after="40"/>
+        <w:ind w:left="0"/>
+      </w:pPr>
+      <w:hyperlink w:anchor="_TocP130030" w:history="1">
+        <w:r>
+          <w:rPr>
+            <w:rFonts w:ascii="Calibri" w:hAnsi="Calibri"/>
+            <w:color w:val="1F2937"/>
+            <w:sz w:val="21"/>
+          </w:rPr>
+          <w:t xml:space="preserve">11. Quatrième passage, 17 septembre 2026 : audit des attendus de l'énoncé mis à jour</w:t>
+        </w:r>
+        <w:r>
+          <w:rPr>
+            <w:rFonts w:ascii="Calibri" w:hAnsi="Calibri"/>
+            <w:color w:val="1F2937"/>
+            <w:sz w:val="21"/>
+          </w:rPr>
+          <w:tab/>
+        </w:r>
+        <w:r>
+          <w:rPr>
+            <w:rFonts w:ascii="Calibri" w:hAnsi="Calibri"/>
+            <w:color w:val="1F2937"/>
+            <w:sz w:val="21"/>
+          </w:rPr>
+          <w:t>14</w:t>
+        </w:r>
+      </w:hyperlink>
       <w:r>
         <w:fldChar w:fldCharType="end"/>
       </w:r>
@@ -245,9 +1289,11 @@
       <w:pPr>
         <w:pStyle w:val="Heading1"/>
       </w:pPr>
+      <w:bookmarkStart w:id="7001" w:name="_TocP130001"/>
       <w:r>
         <w:t>1. Objet et méthode de l'audit</w:t>
       </w:r>
+      <w:bookmarkEnd w:id="7001"/>
     </w:p>
     <w:p>
       <w:r>
@@ -277,9 +1323,11 @@
       <w:pPr>
         <w:pStyle w:val="Heading2"/>
       </w:pPr>
+      <w:bookmarkStart w:id="7002" w:name="_TocP130002"/>
       <w:r>
         <w:t>1.1 Méthode retenue</w:t>
       </w:r>
+      <w:bookmarkEnd w:id="7002"/>
     </w:p>
     <w:p>
       <w:pPr>
@@ -420,9 +1468,11 @@
       <w:pPr>
         <w:pStyle w:val="Heading2"/>
       </w:pPr>
+      <w:bookmarkStart w:id="7003" w:name="_TocP130003"/>
       <w:r>
         <w:t>1.2 Échelle de statut employée</w:t>
       </w:r>
+      <w:bookmarkEnd w:id="7003"/>
     </w:p>
     <w:tbl>
       <w:tblPr>
@@ -724,9 +1774,11 @@
       <w:pPr>
         <w:pStyle w:val="Heading1"/>
       </w:pPr>
+      <w:bookmarkStart w:id="7004" w:name="_TocP130004"/>
       <w:r>
         <w:t>2. Conformité aux livrables attendus</w:t>
       </w:r>
+      <w:bookmarkEnd w:id="7004"/>
     </w:p>
     <w:p>
       <w:r>
@@ -1070,9 +2122,11 @@
       <w:pPr>
         <w:pStyle w:val="Heading1"/>
       </w:pPr>
+      <w:bookmarkStart w:id="7005" w:name="_TocP130005"/>
       <w:r>
         <w:t>3. Grille des indicateurs de qualité, renseignée et auditée</w:t>
       </w:r>
+      <w:bookmarkEnd w:id="7005"/>
     </w:p>
     <w:p>
       <w:r>
@@ -1090,9 +2144,11 @@
       <w:pPr>
         <w:pStyle w:val="Heading2"/>
       </w:pPr>
+      <w:bookmarkStart w:id="7006" w:name="_TocP130006"/>
       <w:r>
         <w:t>3.1 Veille technologique et méthodologique</w:t>
       </w:r>
+      <w:bookmarkEnd w:id="7006"/>
     </w:p>
     <w:tbl>
       <w:tblPr>
@@ -1728,9 +2784,11 @@
       <w:pPr>
         <w:pStyle w:val="Heading2"/>
       </w:pPr>
+      <w:bookmarkStart w:id="7007" w:name="_TocP130007"/>
       <w:r>
         <w:t>3.2 Identification du besoin métier</w:t>
       </w:r>
+      <w:bookmarkEnd w:id="7007"/>
     </w:p>
     <w:tbl>
       <w:tblPr>
@@ -2100,9 +3158,11 @@
       <w:pPr>
         <w:pStyle w:val="Heading2"/>
       </w:pPr>
+      <w:bookmarkStart w:id="7008" w:name="_TocP130008"/>
       <w:r>
         <w:t xml:space="preserve">3.3 Formalisation du cahier des charges fonctionnel</w:t>
       </w:r>
+      <w:bookmarkEnd w:id="7008"/>
     </w:p>
     <w:p>
       <w:r>
@@ -2454,9 +3514,11 @@
       <w:pPr>
         <w:pStyle w:val="Heading2"/>
       </w:pPr>
+      <w:bookmarkStart w:id="7009" w:name="_TocP130009"/>
       <w:r>
         <w:t xml:space="preserve">3.4 Objectifs pédagogiques du projet</w:t>
       </w:r>
+      <w:bookmarkEnd w:id="7009"/>
     </w:p>
     <w:p>
       <w:r>
@@ -3104,9 +4166,11 @@
       <w:pPr>
         <w:pStyle w:val="Heading1"/>
       </w:pPr>
+      <w:bookmarkStart w:id="7010" w:name="_TocP130010"/>
       <w:r>
         <w:t>4. Contrôle des chiffres publiés</w:t>
       </w:r>
+      <w:bookmarkEnd w:id="7010"/>
     </w:p>
     <w:p>
       <w:r>
@@ -3124,9 +4188,11 @@
       <w:pPr>
         <w:pStyle w:val="Heading2"/>
       </w:pPr>
+      <w:bookmarkStart w:id="7011" w:name="_TocP130011"/>
       <w:r>
         <w:t>4.1 Résultats déterministes, confirmés à l'identique</w:t>
       </w:r>
+      <w:bookmarkEnd w:id="7011"/>
     </w:p>
     <w:tbl>
       <w:tblPr>
@@ -4469,17 +5535,21 @@
       <w:pPr>
         <w:pStyle w:val="Heading2"/>
       </w:pPr>
+      <w:bookmarkStart w:id="7012" w:name="_TocP130012"/>
       <w:r>
         <w:t>4.2 Écarts relevés et corrigés</w:t>
       </w:r>
+      <w:bookmarkEnd w:id="7012"/>
     </w:p>
     <w:p>
       <w:pPr>
         <w:pStyle w:val="Heading3"/>
       </w:pPr>
+      <w:bookmarkStart w:id="7013" w:name="_TocP130013"/>
       <w:r>
         <w:t>Écart 1 : facteur d'accélération des moteurs alternatifs</w:t>
       </w:r>
+      <w:bookmarkEnd w:id="7013"/>
     </w:p>
     <w:p>
       <w:r>
@@ -5006,9 +6076,11 @@
       <w:pPr>
         <w:pStyle w:val="Heading3"/>
       </w:pPr>
+      <w:bookmarkStart w:id="7014" w:name="_TocP130014"/>
       <w:r>
         <w:t>Écart 2 : composition de la liste des critères de comparaison</w:t>
       </w:r>
+      <w:bookmarkEnd w:id="7014"/>
     </w:p>
     <w:p>
       <w:r>
@@ -5553,9 +6625,11 @@
       <w:pPr>
         <w:pStyle w:val="Heading3"/>
       </w:pPr>
+      <w:bookmarkStart w:id="7015" w:name="_TocP130015"/>
       <w:r>
         <w:t>Écart 3 : numérotation des jalons</w:t>
       </w:r>
+      <w:bookmarkEnd w:id="7015"/>
     </w:p>
     <w:p>
       <w:r>
@@ -5573,9 +6647,11 @@
       <w:pPr>
         <w:pStyle w:val="Heading3"/>
       </w:pPr>
+      <w:bookmarkStart w:id="7016" w:name="_TocP130016"/>
       <w:r>
         <w:t>Écart 4 : base de calcul de la concentration du chiffre d'affaires</w:t>
       </w:r>
+      <w:bookmarkEnd w:id="7016"/>
     </w:p>
     <w:p>
       <w:r>
@@ -5593,9 +6669,11 @@
       <w:pPr>
         <w:pStyle w:val="Heading3"/>
       </w:pPr>
+      <w:bookmarkStart w:id="7017" w:name="_TocP130017"/>
       <w:r>
         <w:t>Écart 5 : lisibilité du rapport de contrôle qualité dans le notebook</w:t>
       </w:r>
+      <w:bookmarkEnd w:id="7017"/>
     </w:p>
     <w:p>
       <w:r>
@@ -5613,9 +6691,11 @@
       <w:pPr>
         <w:pStyle w:val="Heading3"/>
       </w:pPr>
+      <w:bookmarkStart w:id="7018" w:name="_TocP130018"/>
       <w:r>
         <w:t>Écarts 6 à 11 : corrections rédactionnelles et de complétude</w:t>
       </w:r>
+      <w:bookmarkEnd w:id="7018"/>
     </w:p>
     <w:tbl>
       <w:tblPr>
@@ -5974,9 +7054,11 @@
       <w:pPr>
         <w:pStyle w:val="Heading1"/>
       </w:pPr>
+      <w:bookmarkStart w:id="7019" w:name="_TocP130019"/>
       <w:r>
         <w:t>5. Contrôle rédactionnel et accessibilité</w:t>
       </w:r>
+      <w:bookmarkEnd w:id="7019"/>
     </w:p>
     <w:p>
       <w:r>
@@ -6491,9 +7573,11 @@
       <w:pPr>
         <w:pStyle w:val="Heading1"/>
       </w:pPr>
+      <w:bookmarkStart w:id="7020" w:name="_TocP130020"/>
       <w:r>
         <w:t>6. Risques résiduels et limites de cet audit</w:t>
       </w:r>
+      <w:bookmarkEnd w:id="7020"/>
     </w:p>
     <w:p>
       <w:r>
@@ -6582,9 +7666,11 @@
       <w:pPr>
         <w:pStyle w:val="Heading1"/>
       </w:pPr>
+      <w:bookmarkStart w:id="7021" w:name="_TocP130021"/>
       <w:r>
         <w:t>7. Conclusion de l'audit</w:t>
       </w:r>
+      <w:bookmarkEnd w:id="7021"/>
     </w:p>
     <w:p>
       <w:r>
@@ -6644,9 +7730,11 @@
       <w:pPr>
         <w:pStyle w:val="Heading1"/>
       </w:pPr>
+      <w:bookmarkStart w:id="7022" w:name="_TocP130022"/>
       <w:r>
         <w:t xml:space="preserve">8. Second passage d'audit, 4 août 2026</w:t>
       </w:r>
+      <w:bookmarkEnd w:id="7022"/>
     </w:p>
     <w:p>
       <w:r>
@@ -6664,9 +7752,11 @@
       <w:pPr>
         <w:pStyle w:val="Heading2"/>
       </w:pPr>
+      <w:bookmarkStart w:id="7023" w:name="_TocP130023"/>
       <w:r>
         <w:t xml:space="preserve">8.1 Ce que la troisième réexécution confirme</w:t>
       </w:r>
+      <w:bookmarkEnd w:id="7023"/>
     </w:p>
     <w:p>
       <w:r>
@@ -7454,9 +8544,11 @@
       <w:pPr>
         <w:pStyle w:val="Heading2"/>
       </w:pPr>
+      <w:bookmarkStart w:id="7024" w:name="_TocP130024"/>
       <w:r>
         <w:t xml:space="preserve">8.2 Écarts relevés et corrigés, numérotés à la suite du premier passage</w:t>
       </w:r>
+      <w:bookmarkEnd w:id="7024"/>
     </w:p>
     <w:tbl>
       <w:tblPr>
@@ -8032,9 +9124,11 @@
       <w:pPr>
         <w:pStyle w:val="Heading2"/>
       </w:pPr>
+      <w:bookmarkStart w:id="7025" w:name="_TocP130025"/>
       <w:r>
         <w:t xml:space="preserve">8.3 Autres vérifications sans écart</w:t>
       </w:r>
+      <w:bookmarkEnd w:id="7025"/>
     </w:p>
     <w:p>
       <w:pPr>
@@ -8138,9 +9232,11 @@
       <w:pPr>
         <w:pStyle w:val="Heading1"/>
       </w:pPr>
+      <w:bookmarkStart w:id="7026" w:name="_TocP130026"/>
       <w:r>
         <w:t xml:space="preserve">9. Troisième passage, 3 septembre 2026 : les portfolios et l'état réel du parcours</w:t>
       </w:r>
+      <w:bookmarkEnd w:id="7026"/>
     </w:p>
     <w:p>
       <w:r>
@@ -8158,9 +9254,11 @@
       <w:pPr>
         <w:pStyle w:val="Heading2"/>
       </w:pPr>
+      <w:bookmarkStart w:id="7027" w:name="_TocP130027"/>
       <w:r>
         <w:t xml:space="preserve">9.1 Écarts relevés et corrigés, numérotés à la suite des précédents</w:t>
       </w:r>
+      <w:bookmarkEnd w:id="7027"/>
     </w:p>
     <w:tbl>
       <w:tblPr>
@@ -8854,9 +9952,11 @@
       <w:pPr>
         <w:pStyle w:val="Heading2"/>
       </w:pPr>
+      <w:bookmarkStart w:id="7028" w:name="_TocP130028"/>
       <w:r>
         <w:t xml:space="preserve">9.2 Vérifications rejouées</w:t>
       </w:r>
+      <w:bookmarkEnd w:id="7028"/>
     </w:p>
     <w:p>
       <w:pPr>
@@ -8960,9 +10060,11 @@
       <w:pPr>
         <w:pStyle w:val="Heading1"/>
       </w:pPr>
+      <w:bookmarkStart w:id="7029" w:name="_TocP130029"/>
       <w:r>
         <w:t xml:space="preserve">10. Mise à jour du 17 septembre 2026, à la validation du projet 12</w:t>
       </w:r>
+      <w:bookmarkEnd w:id="7029"/>
     </w:p>
     <w:p>
       <w:r>
@@ -9124,7 +10226,7 @@
                 <w:color w:val="333333"/>
                 <w:sz w:val="18"/>
               </w:rPr>
-              <w:t xml:space="preserve">Projet 13 affiché en cours depuis septembre 2026 ; projet 14 présenté comme stage de Consultant Data / BI et Data Analyst chez S4R, à partir d'octobre 2026 pour environ deux mois</w:t>
+              <w:t xml:space="preserve">Projet 13 affiché en cours depuis septembre 2026 ; projet 14 présenté comme stage de Consultant Data / BI et Data Analyst chez S4R, du 19 octobre au 20 novembre 2026</w:t>
             </w:r>
           </w:p>
         </w:tc>
@@ -9328,9 +10430,11 @@
       <w:pPr>
         <w:pStyle w:val="Heading1"/>
       </w:pPr>
+      <w:bookmarkStart w:id="7030" w:name="_TocP130030"/>
       <w:r>
         <w:t xml:space="preserve">11. Quatrième passage, 17 septembre 2026 : audit des attendus de l'énoncé mis à jour</w:t>
       </w:r>
+      <w:bookmarkEnd w:id="7030"/>
     </w:p>
     <w:p>
       <w:r>

</xml_diff>